<commit_message>
Lưu trữ toàn bộ code Java và JDBC năm 2026
</commit_message>
<xml_diff>
--- a/Toeic/từ vựng/kaka.docx
+++ b/Toeic/từ vựng/kaka.docx
@@ -11,6 +11,44 @@
       </w:r>
       <w:r>
         <w:t xml:space="preserve"> lọc</w:t>
+      </w:r>
+    </w:p>
+    <w:p>
+      <w:pPr>
+        <w:pStyle w:val="Heading2"/>
+        <w:shd w:val="clear" w:color="auto" w:fill="FFFCF3"/>
+        <w:spacing w:before="0" w:beforeAutospacing="0" w:after="0" w:afterAutospacing="0"/>
+        <w:rPr>
+          <w:rFonts w:ascii="Open Sans" w:hAnsi="Open Sans" w:cs="Open Sans"/>
+          <w:color w:val="313033"/>
+        </w:rPr>
+      </w:pPr>
+      <w:r>
+        <w:rPr>
+          <w:rFonts w:ascii="Open Sans" w:hAnsi="Open Sans" w:cs="Open Sans"/>
+          <w:color w:val="313033"/>
+        </w:rPr>
+        <w:t>P</w:t>
+      </w:r>
+      <w:r>
+        <w:rPr>
+          <w:rFonts w:ascii="Open Sans" w:hAnsi="Open Sans" w:cs="Open Sans"/>
+          <w:color w:val="313033"/>
+        </w:rPr>
+        <w:t>roduce</w:t>
+      </w:r>
+      <w:r>
+        <w:rPr>
+          <w:rFonts w:ascii="Open Sans" w:hAnsi="Open Sans" w:cs="Open Sans"/>
+          <w:color w:val="313033"/>
+        </w:rPr>
+        <w:t>== product</w:t>
+      </w:r>
+    </w:p>
+    <w:p/>
+    <w:p>
+      <w:r>
+        <w:t>Employment == job=occupation</w:t>
       </w:r>
     </w:p>
     <w:p>
@@ -211,6 +249,7 @@
           <w:sz w:val="36"/>
           <w:szCs w:val="36"/>
         </w:rPr>
+        <w:lastRenderedPageBreak/>
         <w:t>compromise</w:t>
       </w:r>
     </w:p>
@@ -229,7 +268,6 @@
           <w:rFonts w:ascii="Open Sans" w:hAnsi="Open Sans" w:cs="Open Sans"/>
           <w:color w:val="313033"/>
         </w:rPr>
-        <w:lastRenderedPageBreak/>
         <w:t>release</w:t>
       </w:r>
     </w:p>
@@ -569,6 +607,7 @@
     </w:p>
     <w:p>
       <w:r>
+        <w:lastRenderedPageBreak/>
         <w:t>implement: thực hieejh triển khai cài dặt</w:t>
       </w:r>
     </w:p>
@@ -583,7 +622,6 @@
           <w:rFonts w:ascii="Open Sans" w:hAnsi="Open Sans" w:cs="Open Sans"/>
           <w:color w:val="313033"/>
         </w:rPr>
-        <w:lastRenderedPageBreak/>
         <w:t>persevere: kiên trì</w:t>
       </w:r>
       <w:r>
@@ -837,6 +875,7 @@
         <w:rPr>
           <w:b/>
           <w:bCs/>
+          <w:noProof/>
         </w:rPr>
         <w:lastRenderedPageBreak/>
         <w:drawing>

</xml_diff>